<commit_message>
F2 Cafetería Móvil: contrato alineado con SPEC D16 (4 tramos recíprocos; empresa a 30 días)
Via: Claude Code
Co-Authored-By: Claude Opus 5.5 <noreply@anthropic.com>
</commit_message>
<xml_diff>
--- a/astro-site/public/dl/plan-negocio-cafeteria-movil-eventos/modelo-contrato-servicio-cafe-eventos.docx
+++ b/astro-site/public/dl/plan-negocio-cafeteria-movil-eventos/modelo-contrato-servicio-cafe-eventos.docx
@@ -635,7 +635,7 @@
         <w:spacing w:after="80"/>
       </w:pPr>
       <w:r>
-        <w:t xml:space="preserve">Con 6 meses o más de antelación: </w:t>
+        <w:t xml:space="preserve">Con 60 días o más de antelación: </w:t>
       </w:r>
       <w:r>
         <w:rPr>
@@ -653,13 +653,13 @@
         <w:spacing w:after="80"/>
       </w:pPr>
       <w:r>
-        <w:t xml:space="preserve">De 3 meses a menos de 6: </w:t>
+        <w:t xml:space="preserve">De 30 días a menos de 60: </w:t>
       </w:r>
       <w:r>
         <w:rPr>
           <w:b/>
         </w:rPr>
-        <w:t>25 %</w:t>
+        <w:t>30 %</w:t>
       </w:r>
       <w:r>
         <w:t xml:space="preserve"> del precio.</w:t>
@@ -671,13 +671,13 @@
         <w:spacing w:after="80"/>
       </w:pPr>
       <w:r>
-        <w:t xml:space="preserve">De 1 mes a menos de 3: </w:t>
+        <w:t xml:space="preserve">De 7 días a menos de 30: </w:t>
       </w:r>
       <w:r>
         <w:rPr>
           <w:b/>
         </w:rPr>
-        <w:t>50 %</w:t>
+        <w:t>60 %</w:t>
       </w:r>
       <w:r>
         <w:t xml:space="preserve"> del precio.</w:t>
@@ -689,25 +689,7 @@
         <w:spacing w:after="80"/>
       </w:pPr>
       <w:r>
-        <w:t xml:space="preserve">De 14 días a menos de 1 mes: </w:t>
-      </w:r>
-      <w:r>
-        <w:rPr>
-          <w:b/>
-        </w:rPr>
-        <w:t>75 %</w:t>
-      </w:r>
-      <w:r>
-        <w:t xml:space="preserve"> del precio.</w:t>
-      </w:r>
-    </w:p>
-    <w:p>
-      <w:pPr>
-        <w:pStyle w:val="ListBullet"/>
-        <w:spacing w:after="80"/>
-      </w:pPr>
-      <w:r>
-        <w:t xml:space="preserve">Con menos de 14 días: </w:t>
+        <w:t xml:space="preserve">Con menos de 7 días: </w:t>
       </w:r>
       <w:r>
         <w:rPr>
@@ -770,7 +752,7 @@
         <w:spacing w:after="160"/>
       </w:pPr>
       <w:r>
-        <w:t>El Cliente puede pedir por escrito un cambio de fecha, que la Cafetería acepta si tiene disponibilidad y la nueva fecha cae en los [6] meses siguientes. Es gratuito con 3 meses o más de antelación; en otro caso se cobra un recargo de [importe] € más IVA y se actualiza el precio a la tarifa vigente.</w:t>
+        <w:t>El Cliente puede pedir por escrito un cambio de fecha, que la Cafetería acepta si tiene disponibilidad y la nueva fecha cae en los [6] meses siguientes. Es gratuito con 60 días o más de antelación; en otro caso se cobra un recargo de [importe] € más IVA y se actualiza el precio a la tarifa vigente.</w:t>
       </w:r>
     </w:p>
     <w:p>
@@ -1038,7 +1020,7 @@
         <w:t>70 %</w:t>
       </w:r>
       <w:r>
-        <w:t xml:space="preserve"> a [15] días de la factura, que se emite el día siguiente al evento, con el IVA desglosado. Los retrasos devengan los intereses de demora que la ley permite en operaciones entre empresas, sin necesidad de reclamación previa.</w:t>
+        <w:t xml:space="preserve"> a 30 días de la factura, que se emite el día siguiente al evento, con el IVA desglosado. Los retrasos devengan los intereses de demora que la ley permite en operaciones entre empresas, sin necesidad de reclamación previa.</w:t>
       </w:r>
     </w:p>
     <w:p>
@@ -1053,7 +1035,7 @@
         <w:t>Cancelación por el cliente.</w:t>
       </w:r>
       <w:r>
-        <w:t xml:space="preserve"> La Cafetería retiene sobre el precio total con IVA: con 3 meses o más de antelación, </w:t>
+        <w:t xml:space="preserve"> La Cafetería retiene sobre el precio total con IVA: con 30 días o más de antelación, </w:t>
       </w:r>
       <w:r>
         <w:rPr>
@@ -1062,7 +1044,7 @@
         <w:t>10 %</w:t>
       </w:r>
       <w:r>
-        <w:t xml:space="preserve">; de 1 mes a menos de 3, </w:t>
+        <w:t xml:space="preserve">; de 15 días a menos de 30, </w:t>
       </w:r>
       <w:r>
         <w:rPr>
@@ -1071,7 +1053,7 @@
         <w:t>30 %</w:t>
       </w:r>
       <w:r>
-        <w:t xml:space="preserve">; de 14 días a menos de 1 mes, </w:t>
+        <w:t xml:space="preserve">; de 7 días a menos de 15, </w:t>
       </w:r>
       <w:r>
         <w:rPr>
@@ -1080,7 +1062,7 @@
         <w:t>60 %</w:t>
       </w:r>
       <w:r>
-        <w:t xml:space="preserve">; con menos de 14 días, </w:t>
+        <w:t xml:space="preserve">; con menos de 7 días, </w:t>
       </w:r>
       <w:r>
         <w:rPr>

</xml_diff>

<commit_message>
Contrato Cafetería Móvil: arreglos de la revisión (B1 horas extra al 10 %, M6 precios IVA incluido al consumidor, m25-m27)
Via: Claude Code
Co-Authored-By: Claude Opus 5.5 <noreply@anthropic.com>
</commit_message>
<xml_diff>
--- a/astro-site/public/dl/plan-negocio-cafeteria-movil-eventos/modelo-contrato-servicio-cafe-eventos.docx
+++ b/astro-site/public/dl/plan-negocio-cafeteria-movil-eventos/modelo-contrato-servicio-cafe-eventos.docx
@@ -224,7 +224,7 @@
         <w:t>Horas extra.</w:t>
       </w:r>
       <w:r>
-        <w:t xml:space="preserve"> Si el Cliente quiere prolongar el servicio, lo pide a la Cafetería en el propio evento y esta lo acepta solo si su personal y su material lo permiten. Cada hora o fracción adicional se factura a [importe] € más IVA, en la factura de liquidación.</w:t>
+        <w:t xml:space="preserve"> Si el Cliente quiere prolongar el servicio, lo pide a la Cafetería en el propio evento y esta lo acepta solo si su personal y su material lo permiten. Cada hora o fracción adicional se factura a [importe] € IVA incluido, en la factura de liquidación.</w:t>
       </w:r>
     </w:p>
     <w:p>
@@ -265,7 +265,7 @@
         <w:t>Por invitado.</w:t>
       </w:r>
       <w:r>
-        <w:t xml:space="preserve"> [importe] € más IVA por invitado, con un mínimo garantizado de [número] invitados. El Cliente comunica por escrito el recuento final, con las alergias e intolerancias que conozca, como máximo [7] días antes del evento. Después solo puede subir, si la Cafetería puede atenderlo; no puede bajar del mínimo garantizado, aunque luego asistan menos personas.</w:t>
+        <w:t xml:space="preserve"> [importe] € IVA incluido por invitado, con un mínimo garantizado de [número] invitados. El Cliente comunica por escrito el recuento final, con las alergias e intolerancias que conozca, como máximo [7] días antes del evento. Después solo puede subir, si la Cafetería puede atenderlo; no puede bajar del mínimo garantizado, aunque luego asistan menos personas.</w:t>
       </w:r>
     </w:p>
     <w:p>
@@ -283,7 +283,7 @@
         <w:t>Por hora.</w:t>
       </w:r>
       <w:r>
-        <w:t xml:space="preserve"> [importe] € más IVA por hora de barra abierta y por barista, durante las horas de la cláusula primera, con un mínimo de [número] horas.</w:t>
+        <w:t xml:space="preserve"> [importe] € IVA incluido por hora de barra abierta y por barista, durante las horas de la cláusula primera, con un mínimo de [número] horas.</w:t>
       </w:r>
     </w:p>
     <w:p>
@@ -301,7 +301,7 @@
         <w:t>Por consumición, con mínimo.</w:t>
       </w:r>
       <w:r>
-        <w:t xml:space="preserve"> [importe] € más IVA por bebida servida, con una facturación mínima garantizada de [importe] € más IVA. Si las consumiciones no alcanzan el mínimo, la Cafetería factura la diferencia.</w:t>
+        <w:t xml:space="preserve"> [importe] € IVA incluido por bebida servida, con una facturación mínima garantizada de [importe] € IVA incluido. Si las consumiciones no alcanzan el mínimo, la Cafetería factura la diferencia.</w:t>
       </w:r>
     </w:p>
     <w:p>
@@ -338,7 +338,7 @@
         <w:t>Alérgenos.</w:t>
       </w:r>
       <w:r>
-        <w:t xml:space="preserve"> La Cafetería informa por escrito de los alérgenos de cada bebida y de la bollería: leche (también la sin lactosa), soja, frutos de cáscara (almendra, avellana) y gluten. La bebida de avena se considera cereal con gluten, salvo que sea de una marca certificada sin gluten, y la bollería puede llevar además huevo y sésamo. La barra lleva un cartel con esa información y un aviso de que los invitados pueden preguntar. Usa una jarra distinta para cada tipo de leche, pero no garantiza la ausencia total de trazas: el Cliente avisa de cualquier alergia grave antes del evento y la Cafetería se lo confirma por escrito.</w:t>
+        <w:t xml:space="preserve"> La Cafetería informa por escrito de los alérgenos de cada bebida y de la bollería: leche (también la sin lactosa), soja, frutos de cáscara (almendra, avellana) y gluten. La bebida de avena lleva un cereal con gluten, salvo que sea de una marca certificada sin gluten, y la bollería puede llevar además huevo y sésamo. La barra lleva un cartel con esa información y un aviso de que los invitados pueden preguntar. La Cafetería usa una jarra distinta para cada tipo de leche, pero no garantiza la ausencia total de trazas: el Cliente avisa de cualquier alergia grave antes del evento y la Cafetería se lo confirma por escrito.</w:t>
       </w:r>
     </w:p>
     <w:p>
@@ -390,7 +390,7 @@
         <w:t>Electricidad.</w:t>
       </w:r>
       <w:r>
-        <w:t xml:space="preserve"> Una cafetera profesional de dos grupos consume entre 2,4 y 4,5 kW, y un enchufe de 16 A da unos 3,7 kW. El Cliente facilita una toma eléctrica dedicada, de [número] kW y a menos de [10] metros de la barra, que no comparta con música, iluminación ni cocina. Si no puede, la Cafetería lleva un generador inverter o baterías con un suplemento de [importe] € más IVA, colocado donde indique el recinto y lejos de los invitados.</w:t>
+        <w:t xml:space="preserve"> Una cafetera profesional de dos grupos consume entre 2,4 y 4,5 kW, y un enchufe de 16 A da unos 3,7 kW. El Cliente facilita una toma eléctrica dedicada, de [número] kW y a menos de [10] metros de la barra, que no comparta con música, iluminación ni cocina. Si no puede, la Cafetería lleva un generador inverter o baterías con un suplemento de [importe] € IVA incluido, colocado donde indique el recinto y lejos de los invitados.</w:t>
       </w:r>
     </w:p>
     <w:p>
@@ -435,7 +435,7 @@
         <w:t>Agua.</w:t>
       </w:r>
       <w:r>
-        <w:t xml:space="preserve"> Hay un punto de agua potable a menos de [30] metros, con un grifo accesible. Si no lo hay, la Cafetería lo lleva en depósitos de uso alimentario con un suplemento de [importe] € más IVA. El agua gris se recoge y se retira en depósito propio; nunca se vierte en el terreno.</w:t>
+        <w:t xml:space="preserve"> Hay un punto de agua potable a menos de [30] metros, con un grifo accesible. Si no lo hay, la Cafetería lo lleva en depósitos de uso alimentario con un suplemento de [importe] € IVA incluido. El agua gris se recoge y se retira en depósito propio; nunca se vierte en el terreno.</w:t>
       </w:r>
     </w:p>
     <w:p>
@@ -511,7 +511,7 @@
         <w:spacing w:after="160"/>
       </w:pPr>
       <w:r>
-        <w:t>Si la carta incluye productos salados, la Cafetería conserva una muestra de cada uno (ración mínima de 100 g, siete días, refrigerada o congelada) en cada evento. En las bebidas y la bollería que se sirven tal cual, la Cafetería aplica su criterio, que es una interpretación sin criterio oficial, y lo confirma con su autoridad sanitaria.</w:t>
+        <w:t>Si la carta incluye productos salados, la Cafetería conserva una muestra de cada uno (ración mínima de 100 g, siete días, refrigerada o congelada) en cada evento. En las bebidas y la bollería que se sirven tal cual, la Cafetería sigue el criterio que le indique su autoridad sanitaria.</w:t>
       </w:r>
     </w:p>
     <w:p>
@@ -534,7 +534,7 @@
         <w:spacing w:after="160"/>
       </w:pPr>
       <w:r>
-        <w:t>El precio es el que resulte de la modalidad de la cláusula segunda, estimado en [importe base] € más el IVA del 10 % para todo lo que se sirve para consumir en el acto, que asciende a [importe del IVA] €, lo que suma [importe total] € con IVA incluido. Los extras con precio propio, el suplemento de generador, las horas extra y los vasos de un solo uso llevan el IVA del 21 %, desglosado. Si el precio final depende del recuento, de las horas o de las consumiciones, se ajusta en la factura de liquidación.</w:t>
+        <w:t>El precio total que paga el Cliente es de [importe total] € con el IVA incluido, que se desglosa así: [importe base] € de base y [importe del IVA] € de IVA del 10 %, tipo que se aplica a todo lo que se sirve para consumir en el acto, incluidas las horas extra de barra, que son el mismo servicio. Los extras con precio propio que no forman parte de la barra (personalización de bebidas, tazas con el nombre de los novios, talleres de latte art) llevan el IVA del 21 %, desglosado. Para el suplemento de generador y los vasos de un solo uso, se aplica el IVA que corresponda; confírmalo con tu asesoría. Si el precio final depende del recuento, de las horas o de las consumiciones, se ajusta en la factura de liquidación.</w:t>
       </w:r>
     </w:p>
     <w:p>
@@ -752,7 +752,7 @@
         <w:spacing w:after="160"/>
       </w:pPr>
       <w:r>
-        <w:t>El Cliente puede pedir por escrito un cambio de fecha, que la Cafetería acepta si tiene disponibilidad y la nueva fecha cae en los [6] meses siguientes. Es gratuito con 60 días o más de antelación; en otro caso se cobra un recargo de [importe] € más IVA y se actualiza el precio a la tarifa vigente.</w:t>
+        <w:t>El Cliente puede pedir por escrito un cambio de fecha, que la Cafetería acepta si tiene disponibilidad y la nueva fecha cae en los [6] meses siguientes. Es gratuito con 60 días o más de antelación; en otro caso se cobra un recargo de [importe] € IVA incluido y se actualiza el precio a la tarifa vigente.</w:t>
       </w:r>
     </w:p>
     <w:p>
@@ -1116,7 +1116,7 @@
         <w:t>Ferias y mercados: la Cafetería.</w:t>
       </w:r>
       <w:r>
-        <w:t xml:space="preserve"> Vende por su cuenta y emite sus tickets, con las normas sanitarias de la cláusula quinta. El canon o la tasa del organizador es de [importe] € o del [15] % de la venta, y se detalla en la factura del organizador. No hay exclusividad, salvo pacto expreso por escrito.</w:t>
+        <w:t xml:space="preserve"> Vende por su cuenta y emite sus tiques, con las normas sanitarias de la cláusula quinta. El canon o la tasa del organizador es de [importe] € o del [15] % de la venta, y se detalla en la factura del organizador. No hay exclusividad, salvo pacto expreso por escrito.</w:t>
       </w:r>
     </w:p>
     <w:p>
@@ -1178,6 +1178,14 @@
       </w:pPr>
       <w:r>
         <w:t>NIF/CIF: ______________        CIF: ______________        Cargo: ______________</w:t>
+      </w:r>
+    </w:p>
+    <w:p>
+      <w:pPr>
+        <w:spacing w:after="160"/>
+      </w:pPr>
+      <w:r>
+        <w:t>Versión 1.0 · octubre 2026 · aichef.pro/plan-negocio-cafeteria-movil-eventos</w:t>
       </w:r>
     </w:p>
     <w:sectPr>

</xml_diff>